<commit_message>
Update explanation doc - add end to end request flow breakdown
</commit_message>
<xml_diff>
--- a/how-the-secret-is-used.docx
+++ b/how-the-secret-is-used.docx
@@ -15,12 +15,12 @@
           <w:sz w:val="36"/>
           <w:szCs w:val="36"/>
         </w:rPr>
-        <w:t xml:space="preserve">How the Secret is Used</w:t>
-      </w:r>
-    </w:p>
-    <w:p>
-      <w:pPr>
-        <w:spacing w:after="320" w:before="0"/>
+        <w:t xml:space="preserve">Kubernetes Class 1 — Key Concepts Explained</w:t>
+      </w:r>
+    </w:p>
+    <w:p>
+      <w:pPr>
+        <w:spacing w:after="400" w:before="0"/>
       </w:pPr>
       <w:r>
         <w:rPr>
@@ -29,7 +29,35 @@
           <w:sz w:val="20"/>
           <w:szCs w:val="20"/>
         </w:rPr>
-        <w:t xml:space="preserve">Kubernetes Class 1 — MongoDB Deployment</w:t>
+        <w:t xml:space="preserve">MongoDB + Mongo Express Deployment  |  Udoka Ineh</w:t>
+      </w:r>
+    </w:p>
+    <w:p>
+      <w:pPr>
+        <w:pStyle w:val="Heading1"/>
+        <w:pBdr>
+          <w:bottom w:val="single" w:color="1E5FA8" w:sz="4" w:space="6"/>
+        </w:pBdr>
+        <w:spacing w:after="160" w:before="360"/>
+      </w:pPr>
+      <w:r>
+        <w:rPr>
+          <w:rFonts w:ascii="Arial" w:cs="Arial" w:eastAsia="Arial" w:hAnsi="Arial"/>
+          <w:b/>
+          <w:bCs/>
+          <w:color w:val="1E5FA8"/>
+          <w:sz w:val="30"/>
+          <w:szCs w:val="30"/>
+        </w:rPr>
+        <w:t xml:space="preserve">Part 1 — How the Secret is Used</w:t>
+      </w:r>
+    </w:p>
+    <w:p>
+      <w:pPr>
+        <w:spacing w:after="100" w:before="100"/>
+      </w:pPr>
+      <w:r>
+        <w:t xml:space="preserve"/>
       </w:r>
     </w:p>
     <w:p>
@@ -197,7 +225,7 @@
     </w:tbl>
     <w:p>
       <w:pPr>
-        <w:spacing w:after="120" w:before="120"/>
+        <w:spacing w:after="100" w:before="100"/>
       </w:pPr>
       <w:r>
         <w:t xml:space="preserve"/>
@@ -215,7 +243,7 @@
           <w:sz w:val="22"/>
           <w:szCs w:val="22"/>
         </w:rPr>
-        <w:t xml:space="preserve">Breaking it down:</w:t>
+        <w:t xml:space="preserve">My understanding:</w:t>
       </w:r>
     </w:p>
     <w:p>
@@ -225,15 +253,15 @@
           <w:ilvl w:val="0"/>
           <w:numId w:val="2"/>
         </w:numPr>
-        <w:spacing w:after="80" w:before="80"/>
-      </w:pPr>
-      <w:r>
-        <w:rPr>
-          <w:rFonts w:ascii="Arial" w:cs="Arial" w:eastAsia="Arial" w:hAnsi="Arial"/>
-          <w:sz w:val="22"/>
-          <w:szCs w:val="22"/>
-        </w:rPr>
-        <w:t xml:space="preserve">The Secret stores the MongoDB username and password as base64 values inside the cluster.</w:t>
+        <w:spacing w:after="60" w:before="60"/>
+      </w:pPr>
+      <w:r>
+        <w:rPr>
+          <w:rFonts w:ascii="Arial" w:cs="Arial" w:eastAsia="Arial" w:hAnsi="Arial"/>
+          <w:sz w:val="22"/>
+          <w:szCs w:val="22"/>
+        </w:rPr>
+        <w:t xml:space="preserve">The Secret stores my MongoDB username and password as base64 values inside the cluster.</w:t>
       </w:r>
     </w:p>
     <w:p>
@@ -243,7 +271,7 @@
           <w:ilvl w:val="0"/>
           <w:numId w:val="2"/>
         </w:numPr>
-        <w:spacing w:after="80" w:before="80"/>
+        <w:spacing w:after="60" w:before="60"/>
       </w:pPr>
       <w:r>
         <w:rPr>
@@ -261,7 +289,7 @@
           <w:ilvl w:val="0"/>
           <w:numId w:val="2"/>
         </w:numPr>
-        <w:spacing w:after="80" w:before="80"/>
+        <w:spacing w:after="60" w:before="60"/>
       </w:pPr>
       <w:r>
         <w:rPr>
@@ -279,15 +307,15 @@
           <w:ilvl w:val="0"/>
           <w:numId w:val="2"/>
         </w:numPr>
-        <w:spacing w:after="80" w:before="80"/>
-      </w:pPr>
-      <w:r>
-        <w:rPr>
-          <w:rFonts w:ascii="Arial" w:cs="Arial" w:eastAsia="Arial" w:hAnsi="Arial"/>
-          <w:sz w:val="22"/>
-          <w:szCs w:val="22"/>
-        </w:rPr>
-        <w:t xml:space="preserve">secretKeyRef is just a pointer. It tells Kubernetes which Secret to look in and which key to grab — the actual password never appears in the YAML file.</w:t>
+        <w:spacing w:after="60" w:before="60"/>
+      </w:pPr>
+      <w:r>
+        <w:rPr>
+          <w:rFonts w:ascii="Arial" w:cs="Arial" w:eastAsia="Arial" w:hAnsi="Arial"/>
+          <w:sz w:val="22"/>
+          <w:szCs w:val="22"/>
+        </w:rPr>
+        <w:t xml:space="preserve">secretKeyRef is just a pointer. It tells Kubernetes which Secret to look in and which key to grab — the actual password never appears in my YAML file.</w:t>
       </w:r>
     </w:p>
     <w:p>
@@ -297,20 +325,20 @@
           <w:ilvl w:val="0"/>
           <w:numId w:val="2"/>
         </w:numPr>
-        <w:spacing w:after="80" w:before="80"/>
-      </w:pPr>
-      <w:r>
-        <w:rPr>
-          <w:rFonts w:ascii="Arial" w:cs="Arial" w:eastAsia="Arial" w:hAnsi="Arial"/>
-          <w:sz w:val="22"/>
-          <w:szCs w:val="22"/>
-        </w:rPr>
-        <w:t xml:space="preserve">This means your YAML is safe to share or commit to GitHub — it contains only a reference, never the real credentials.</w:t>
-      </w:r>
-    </w:p>
-    <w:p>
-      <w:pPr>
-        <w:spacing w:after="120" w:before="120"/>
+        <w:spacing w:after="60" w:before="60"/>
+      </w:pPr>
+      <w:r>
+        <w:rPr>
+          <w:rFonts w:ascii="Arial" w:cs="Arial" w:eastAsia="Arial" w:hAnsi="Arial"/>
+          <w:sz w:val="22"/>
+          <w:szCs w:val="22"/>
+        </w:rPr>
+        <w:t xml:space="preserve">This means my YAML is safe to commit to GitHub — it contains only a reference, never the real credentials.</w:t>
+      </w:r>
+    </w:p>
+    <w:p>
+      <w:pPr>
+        <w:spacing w:after="100" w:before="100"/>
       </w:pPr>
       <w:r>
         <w:t xml:space="preserve"/>
@@ -318,7 +346,7 @@
     </w:p>
     <w:p>
       <w:pPr>
-        <w:spacing w:after="100" w:before="100"/>
+        <w:spacing w:after="100" w:before="80"/>
       </w:pPr>
       <w:r>
         <w:rPr>
@@ -336,7 +364,357 @@
           <w:sz w:val="22"/>
           <w:szCs w:val="22"/>
         </w:rPr>
-        <w:t xml:space="preserve">your YAML tells Kubernetes where to find the password. Kubernetes fetches it and passes it to the container silently at startup.</w:t>
+        <w:t xml:space="preserve">my YAML tells Kubernetes where to find the password. Kubernetes fetches it and passes it to the container silently at startup.</w:t>
+      </w:r>
+    </w:p>
+    <w:p>
+      <w:pPr>
+        <w:pBdr>
+          <w:bottom w:val="single" w:color="DDDDDD" w:sz="2" w:space="4"/>
+        </w:pBdr>
+        <w:spacing w:after="200" w:before="200"/>
+      </w:pPr>
+      <w:r>
+        <w:t xml:space="preserve"/>
+      </w:r>
+    </w:p>
+    <w:p>
+      <w:pPr>
+        <w:pStyle w:val="Heading1"/>
+        <w:pBdr>
+          <w:bottom w:val="single" w:color="1E5FA8" w:sz="4" w:space="6"/>
+        </w:pBdr>
+        <w:spacing w:after="160" w:before="360"/>
+      </w:pPr>
+      <w:r>
+        <w:rPr>
+          <w:rFonts w:ascii="Arial" w:cs="Arial" w:eastAsia="Arial" w:hAnsi="Arial"/>
+          <w:b/>
+          <w:bCs/>
+          <w:color w:val="1E5FA8"/>
+          <w:sz w:val="30"/>
+          <w:szCs w:val="30"/>
+        </w:rPr>
+        <w:t xml:space="preserve">Part 2 — What Just Happened End to End</w:t>
+      </w:r>
+    </w:p>
+    <w:p>
+      <w:pPr>
+        <w:spacing w:after="100" w:before="100"/>
+      </w:pPr>
+      <w:r>
+        <w:t xml:space="preserve"/>
+      </w:r>
+    </w:p>
+    <w:p>
+      <w:pPr>
+        <w:spacing w:after="120" w:before="0"/>
+      </w:pPr>
+      <w:r>
+        <w:rPr>
+          <w:rFonts w:ascii="Arial" w:cs="Arial" w:eastAsia="Arial" w:hAnsi="Arial"/>
+          <w:b/>
+          <w:bCs/>
+          <w:sz w:val="22"/>
+          <w:szCs w:val="22"/>
+        </w:rPr>
+        <w:t xml:space="preserve">From the document:</w:t>
+      </w:r>
+    </w:p>
+    <w:tbl>
+      <w:tblPr>
+        <w:tblW w:type="dxa" w:w="9360"/>
+        <w:tblBorders>
+          <w:top w:val="single" w:color="auto" w:sz="4"/>
+          <w:left w:val="single" w:color="auto" w:sz="4"/>
+          <w:bottom w:val="single" w:color="auto" w:sz="4"/>
+          <w:right w:val="single" w:color="auto" w:sz="4"/>
+          <w:insideH w:val="single" w:color="auto" w:sz="4"/>
+          <w:insideV w:val="single" w:color="auto" w:sz="4"/>
+        </w:tblBorders>
+      </w:tblPr>
+      <w:tblGrid>
+        <w:gridCol w:w="9360"/>
+      </w:tblGrid>
+      <w:tr>
+        <w:tc>
+          <w:tcPr>
+            <w:tcW w:type="dxa" w:w="9360"/>
+            <w:tcBorders>
+              <w:top w:val="single" w:color="CCCCCC" w:sz="1"/>
+              <w:left w:val="single" w:color="CCCCCC" w:sz="1"/>
+              <w:bottom w:val="single" w:color="CCCCCC" w:sz="1"/>
+              <w:right w:val="single" w:color="CCCCCC" w:sz="1"/>
+            </w:tcBorders>
+            <w:shd w:fill="F0FFF4" w:val="clear"/>
+            <w:tcMar>
+              <w:top w:type="dxa" w:w="160"/>
+              <w:left w:type="dxa" w:w="240"/>
+              <w:bottom w:type="dxa" w:w="160"/>
+              <w:right w:type="dxa" w:w="240"/>
+            </w:tcMar>
+          </w:tcPr>
+          <w:p>
+            <w:pPr>
+              <w:spacing w:after="40" w:before="40"/>
+            </w:pPr>
+            <w:r>
+              <w:rPr>
+                <w:rFonts w:ascii="Arial" w:cs="Arial" w:eastAsia="Arial" w:hAnsi="Arial"/>
+                <w:i/>
+                <w:iCs/>
+                <w:color w:val="333333"/>
+                <w:sz w:val="21"/>
+                <w:szCs w:val="21"/>
+              </w:rPr>
+              <w:t xml:space="preserve">Your browser hit the nodePort on the minikube VM. kube-proxy forwarded it to the</w:t>
+            </w:r>
+          </w:p>
+          <w:p>
+            <w:pPr>
+              <w:spacing w:after="40" w:before="40"/>
+            </w:pPr>
+            <w:r>
+              <w:rPr>
+                <w:rFonts w:ascii="Arial" w:cs="Arial" w:eastAsia="Arial" w:hAnsi="Arial"/>
+                <w:i/>
+                <w:iCs/>
+                <w:color w:val="333333"/>
+                <w:sz w:val="21"/>
+                <w:szCs w:val="21"/>
+              </w:rPr>
+              <w:t xml:space="preserve">mongo-express-service ClusterIP. The Service load-balanced to the one Mongo Express pod.</w:t>
+            </w:r>
+          </w:p>
+          <w:p>
+            <w:pPr>
+              <w:spacing w:after="40" w:before="40"/>
+            </w:pPr>
+            <w:r>
+              <w:rPr>
+                <w:rFonts w:ascii="Arial" w:cs="Arial" w:eastAsia="Arial" w:hAnsi="Arial"/>
+                <w:i/>
+                <w:iCs/>
+                <w:color w:val="333333"/>
+                <w:sz w:val="21"/>
+                <w:szCs w:val="21"/>
+              </w:rPr>
+              <w:t xml:space="preserve">Mongo Express read ME_CONFIG_MONGODB_SERVER from the ConfigMap, looked it up via DNS,</w:t>
+            </w:r>
+          </w:p>
+          <w:p>
+            <w:pPr>
+              <w:spacing w:after="40" w:before="40"/>
+            </w:pPr>
+            <w:r>
+              <w:rPr>
+                <w:rFonts w:ascii="Arial" w:cs="Arial" w:eastAsia="Arial" w:hAnsi="Arial"/>
+                <w:i/>
+                <w:iCs/>
+                <w:color w:val="333333"/>
+                <w:sz w:val="21"/>
+                <w:szCs w:val="21"/>
+              </w:rPr>
+              <w:t xml:space="preserve">and connected to mongodb-service — which forwarded to the MongoDB pod, which</w:t>
+            </w:r>
+          </w:p>
+          <w:p>
+            <w:pPr>
+              <w:spacing w:after="40" w:before="40"/>
+            </w:pPr>
+            <w:r>
+              <w:rPr>
+                <w:rFonts w:ascii="Arial" w:cs="Arial" w:eastAsia="Arial" w:hAnsi="Arial"/>
+                <w:i/>
+                <w:iCs/>
+                <w:color w:val="333333"/>
+                <w:sz w:val="21"/>
+                <w:szCs w:val="21"/>
+              </w:rPr>
+              <w:t xml:space="preserve">authenticated using credentials from the same Secret. Seven components, one smooth request.</w:t>
+            </w:r>
+          </w:p>
+        </w:tc>
+      </w:tr>
+    </w:tbl>
+    <w:p>
+      <w:pPr>
+        <w:spacing w:after="100" w:before="100"/>
+      </w:pPr>
+      <w:r>
+        <w:t xml:space="preserve"/>
+      </w:r>
+    </w:p>
+    <w:p>
+      <w:pPr>
+        <w:spacing w:after="120" w:before="0"/>
+      </w:pPr>
+      <w:r>
+        <w:rPr>
+          <w:rFonts w:ascii="Arial" w:cs="Arial" w:eastAsia="Arial" w:hAnsi="Arial"/>
+          <w:b/>
+          <w:bCs/>
+          <w:sz w:val="22"/>
+          <w:szCs w:val="22"/>
+        </w:rPr>
+        <w:t xml:space="preserve">My understanding:</w:t>
+      </w:r>
+    </w:p>
+    <w:p>
+      <w:pPr>
+        <w:pStyle w:val="ListParagraph"/>
+        <w:numPr>
+          <w:ilvl w:val="0"/>
+          <w:numId w:val="2"/>
+        </w:numPr>
+        <w:spacing w:after="60" w:before="60"/>
+      </w:pPr>
+      <w:r>
+        <w:rPr>
+          <w:rFonts w:ascii="Arial" w:cs="Arial" w:eastAsia="Arial" w:hAnsi="Arial"/>
+          <w:sz w:val="22"/>
+          <w:szCs w:val="22"/>
+        </w:rPr>
+        <w:t xml:space="preserve">My browser sent a request to the nodePort — a port opened directly on the Minikube VM at http://192.168.49.2:30000.</w:t>
+      </w:r>
+    </w:p>
+    <w:p>
+      <w:pPr>
+        <w:pStyle w:val="ListParagraph"/>
+        <w:numPr>
+          <w:ilvl w:val="0"/>
+          <w:numId w:val="2"/>
+        </w:numPr>
+        <w:spacing w:after="60" w:before="60"/>
+      </w:pPr>
+      <w:r>
+        <w:rPr>
+          <w:rFonts w:ascii="Arial" w:cs="Arial" w:eastAsia="Arial" w:hAnsi="Arial"/>
+          <w:sz w:val="22"/>
+          <w:szCs w:val="22"/>
+        </w:rPr>
+        <w:t xml:space="preserve">kube-proxy received that request and forwarded it to the mongo-express-service, which has a stable internal IP (ClusterIP).</w:t>
+      </w:r>
+    </w:p>
+    <w:p>
+      <w:pPr>
+        <w:pStyle w:val="ListParagraph"/>
+        <w:numPr>
+          <w:ilvl w:val="0"/>
+          <w:numId w:val="2"/>
+        </w:numPr>
+        <w:spacing w:after="60" w:before="60"/>
+      </w:pPr>
+      <w:r>
+        <w:rPr>
+          <w:rFonts w:ascii="Arial" w:cs="Arial" w:eastAsia="Arial" w:hAnsi="Arial"/>
+          <w:sz w:val="22"/>
+          <w:szCs w:val="22"/>
+        </w:rPr>
+        <w:t xml:space="preserve">The Service picked the Mongo Express pod and sent the request to it — this is the load balancing step.</w:t>
+      </w:r>
+    </w:p>
+    <w:p>
+      <w:pPr>
+        <w:pStyle w:val="ListParagraph"/>
+        <w:numPr>
+          <w:ilvl w:val="0"/>
+          <w:numId w:val="2"/>
+        </w:numPr>
+        <w:spacing w:after="60" w:before="60"/>
+      </w:pPr>
+      <w:r>
+        <w:rPr>
+          <w:rFonts w:ascii="Arial" w:cs="Arial" w:eastAsia="Arial" w:hAnsi="Arial"/>
+          <w:sz w:val="22"/>
+          <w:szCs w:val="22"/>
+        </w:rPr>
+        <w:t xml:space="preserve">Mongo Express needed to know where MongoDB lives. It read ME_CONFIG_MONGODB_SERVER from the ConfigMap I created, which held the value mongodb-service.</w:t>
+      </w:r>
+    </w:p>
+    <w:p>
+      <w:pPr>
+        <w:pStyle w:val="ListParagraph"/>
+        <w:numPr>
+          <w:ilvl w:val="0"/>
+          <w:numId w:val="2"/>
+        </w:numPr>
+        <w:spacing w:after="60" w:before="60"/>
+      </w:pPr>
+      <w:r>
+        <w:rPr>
+          <w:rFonts w:ascii="Arial" w:cs="Arial" w:eastAsia="Arial" w:hAnsi="Arial"/>
+          <w:sz w:val="22"/>
+          <w:szCs w:val="22"/>
+        </w:rPr>
+        <w:t xml:space="preserve">Kubernetes DNS resolved mongodb-service to the actual IP of the MongoDB Service inside my cluster.</w:t>
+      </w:r>
+    </w:p>
+    <w:p>
+      <w:pPr>
+        <w:pStyle w:val="ListParagraph"/>
+        <w:numPr>
+          <w:ilvl w:val="0"/>
+          <w:numId w:val="2"/>
+        </w:numPr>
+        <w:spacing w:after="60" w:before="60"/>
+      </w:pPr>
+      <w:r>
+        <w:rPr>
+          <w:rFonts w:ascii="Arial" w:cs="Arial" w:eastAsia="Arial" w:hAnsi="Arial"/>
+          <w:sz w:val="22"/>
+          <w:szCs w:val="22"/>
+        </w:rPr>
+        <w:t xml:space="preserve">The MongoDB Service forwarded the connection to the MongoDB pod.</w:t>
+      </w:r>
+    </w:p>
+    <w:p>
+      <w:pPr>
+        <w:pStyle w:val="ListParagraph"/>
+        <w:numPr>
+          <w:ilvl w:val="0"/>
+          <w:numId w:val="2"/>
+        </w:numPr>
+        <w:spacing w:after="60" w:before="60"/>
+      </w:pPr>
+      <w:r>
+        <w:rPr>
+          <w:rFonts w:ascii="Arial" w:cs="Arial" w:eastAsia="Arial" w:hAnsi="Arial"/>
+          <w:sz w:val="22"/>
+          <w:szCs w:val="22"/>
+        </w:rPr>
+        <w:t xml:space="preserve">MongoDB checked the username and password — which came from the same Secret I created — and granted access.</w:t>
+      </w:r>
+    </w:p>
+    <w:p>
+      <w:pPr>
+        <w:spacing w:after="100" w:before="100"/>
+      </w:pPr>
+      <w:r>
+        <w:t xml:space="preserve"/>
+      </w:r>
+    </w:p>
+    <w:p>
+      <w:pPr>
+        <w:spacing w:after="100" w:before="80"/>
+      </w:pPr>
+      <w:r>
+        <w:rPr>
+          <w:rFonts w:ascii="Arial" w:cs="Arial" w:eastAsia="Arial" w:hAnsi="Arial"/>
+          <w:b/>
+          <w:bCs/>
+          <w:sz w:val="22"/>
+          <w:szCs w:val="22"/>
+        </w:rPr>
+        <w:t xml:space="preserve">In short: </w:t>
+      </w:r>
+      <w:r>
+        <w:rPr>
+          <w:rFonts w:ascii="Arial" w:cs="Arial" w:eastAsia="Arial" w:hAnsi="Arial"/>
+          <w:sz w:val="22"/>
+          <w:szCs w:val="22"/>
+        </w:rPr>
+        <w:t xml:space="preserve">one browser request quietly passed through 7 components — nodePort → kube-proxy → Service → pod → ConfigMap → DNS → MongoDB — all wired together by the YAML files I wrote.</w:t>
       </w:r>
     </w:p>
     <w:sectPr>
@@ -729,7 +1107,7 @@
     <w:next w:val="Normal"/>
     <w:qFormat/>
     <w:pPr>
-      <w:spacing w:after="120" w:before="200"/>
+      <w:spacing w:after="160" w:before="360"/>
       <w:outlineLvl w:val="0"/>
     </w:pPr>
     <w:rPr>
@@ -737,26 +1115,8 @@
       <w:b/>
       <w:bCs/>
       <w:color w:val="1E5FA8"/>
-      <w:sz w:val="26"/>
-      <w:szCs w:val="26"/>
-    </w:rPr>
-  </w:style>
-  <w:style w:type="paragraph" w:styleId="Heading2">
-    <w:name w:val="Heading 2"/>
-    <w:basedOn w:val="Normal"/>
-    <w:next w:val="Normal"/>
-    <w:qFormat/>
-    <w:pPr>
-      <w:spacing w:after="100" w:before="180"/>
-      <w:outlineLvl w:val="1"/>
-    </w:pPr>
-    <w:rPr>
-      <w:rFonts w:ascii="Arial" w:cs="Arial" w:eastAsia="Arial" w:hAnsi="Arial"/>
-      <w:b/>
-      <w:bCs/>
-      <w:color w:val="222222"/>
-      <w:sz w:val="23"/>
-      <w:szCs w:val="23"/>
+      <w:sz w:val="30"/>
+      <w:szCs w:val="30"/>
     </w:rPr>
   </w:style>
 </w:styles>

</xml_diff>